<commit_message>
feat(docx): headers, footers, text boxes, comments and chart tables
</commit_message>
<xml_diff>
--- a/sample.docx
+++ b/sample.docx
@@ -1,6 +1,6 @@
 
 <file path=word/document.xml><?xml version="1.0" encoding="utf-8"?>
-<w:document xmlns:w="http://schemas.openxmlformats.org/wordprocessingml/2006/main" xmlns:r="http://schemas.openxmlformats.org/officeDocument/2006/relationships" xmlns:wp="http://schemas.openxmlformats.org/drawingml/2006/wordprocessingDrawing" xmlns:a="http://schemas.openxmlformats.org/drawingml/2006/main" xmlns:pic="http://schemas.openxmlformats.org/drawingml/2006/picture" xmlns:mc="http://schemas.openxmlformats.org/markup-compatibility/2006" xmlns:v="urn:schemas-microsoft-com:vml">
+<w:document xmlns:c="http://schemas.openxmlformats.org/drawingml/2006/chart" xmlns:w="http://schemas.openxmlformats.org/wordprocessingml/2006/main" xmlns:r="http://schemas.openxmlformats.org/officeDocument/2006/relationships" xmlns:wp="http://schemas.openxmlformats.org/drawingml/2006/wordprocessingDrawing" xmlns:a="http://schemas.openxmlformats.org/drawingml/2006/main" xmlns:pic="http://schemas.openxmlformats.org/drawingml/2006/picture" xmlns:mc="http://schemas.openxmlformats.org/markup-compatibility/2006" xmlns:v="urn:schemas-microsoft-com:vml">
   <w:body>
     <w:p>
       <w:pPr>
@@ -49,12 +49,17 @@
       <w:r>
         <w:t xml:space="preserve"> and ships in </w:t>
       </w:r>
+      <w:commentRangeStart w:id="0"/>
       <w:r>
         <w:rPr>
           <w:b/>
           <w:i/>
         </w:rPr>
         <w:t xml:space="preserve">Q3</w:t>
+      </w:r>
+      <w:commentRangeEnd w:id="0"/>
+      <w:r>
+        <w:commentReference w:id="0"/>
       </w:r>
       <w:r>
         <w:t xml:space="preserve">. Text can be </w:t>
@@ -416,6 +421,21 @@
       </w:r>
     </w:p>
     <w:p>
+      <w:r>
+        <w:drawing>
+          <wp:inline>
+            <wp:extent cx="952500" cy="476250"/>
+            <wp:docPr id="7" name="Chart 1" descr="Revenue by quarter"/>
+            <a:graphic>
+              <a:graphicData uri="http://schemas.openxmlformats.org/drawingml/2006/chart">
+                <c:chart r:id="rIdChart"/>
+              </a:graphicData>
+            </a:graphic>
+          </wp:inline>
+        </w:drawing>
+      </w:r>
+    </w:p>
+    <w:p>
       <w:pPr>
         <w:pStyle w:val="Quote"/>
       </w:pPr>
@@ -423,8 +443,23 @@
         <w:t xml:space="preserve">Documents stay read-only; nothing is ever written back.</w:t>
       </w:r>
     </w:p>
+    <w:sectPr>
+      <w:headerReference w:type="default" r:id="rIdHdr"/>
+    </w:sectPr>
   </w:body>
 </w:document>
+</file>
+
+<file path=word/comments.xml><?xml version="1.0" encoding="utf-8"?>
+<w:comments xmlns:w="http://schemas.openxmlformats.org/wordprocessingml/2006/main">
+  <w:comment w:id="0" w:author="Ada" w:date="2026-10-16T09:00:00Z">
+    <w:p>
+      <w:r>
+        <w:t>Confirm the ship quarter with the release team.</w:t>
+      </w:r>
+    </w:p>
+  </w:comment>
+</w:comments>
 </file>
 
 <file path=word/footnotes.xml><?xml version="1.0" encoding="utf-8"?>
@@ -454,6 +489,16 @@
     </w:p>
   </w:footnote>
 </w:footnotes>
+</file>
+
+<file path=word/header1.xml><?xml version="1.0" encoding="utf-8"?>
+<w:hdr xmlns:w="http://schemas.openxmlformats.org/wordprocessingml/2006/main">
+  <w:p>
+    <w:r>
+      <w:t xml:space="preserve">MarkCopy sample  |  Internal draft</w:t>
+    </w:r>
+  </w:p>
+</w:hdr>
 </file>
 
 <file path=word/numbering.xml><?xml version="1.0" encoding="utf-8"?>
@@ -514,4 +559,117 @@
     </w:rPr>
   </w:style>
 </w:styles>
+</file>
+
+<file path=word/charts/chart1.xml><?xml version="1.0" encoding="utf-8"?>
+<c:chartSpace xmlns:c="http://schemas.openxmlformats.org/drawingml/2006/chart" xmlns:a="http://schemas.openxmlformats.org/drawingml/2006/main">
+  <c:chart>
+    <c:title>
+      <c:tx>
+        <c:rich>
+          <a:p>
+            <a:r>
+              <a:t>Revenue by quarter</a:t>
+            </a:r>
+          </a:p>
+        </c:rich>
+      </c:tx>
+    </c:title>
+    <c:plotArea>
+      <c:barChart>
+        <c:barDir val="col"/>
+        <c:ser>
+          <c:tx>
+            <c:strRef>
+              <c:strCache>
+                <c:ptCount val="1"/>
+                <c:pt idx="0">
+                  <c:v>2025</c:v>
+                </c:pt>
+              </c:strCache>
+            </c:strRef>
+          </c:tx>
+          <c:cat>
+            <c:strRef>
+              <c:strCache>
+                <c:ptCount val="3"/>
+                <c:pt idx="0">
+                  <c:v>Q1</c:v>
+                </c:pt>
+                <c:pt idx="1">
+                  <c:v>Q2</c:v>
+                </c:pt>
+                <c:pt idx="2">
+                  <c:v>Q3</c:v>
+                </c:pt>
+              </c:strCache>
+            </c:strRef>
+          </c:cat>
+          <c:val>
+            <c:numRef>
+              <c:numCache>
+                <c:formatCode>General</c:formatCode>
+                <c:ptCount val="3"/>
+                <c:pt idx="0">
+                  <c:v>10</c:v>
+                </c:pt>
+                <c:pt idx="1">
+                  <c:v>14</c:v>
+                </c:pt>
+                <c:pt idx="2">
+                  <c:v>18</c:v>
+                </c:pt>
+              </c:numCache>
+            </c:numRef>
+          </c:val>
+        </c:ser>
+        <c:ser>
+          <c:tx>
+            <c:strRef>
+              <c:strCache>
+                <c:ptCount val="1"/>
+                <c:pt idx="0">
+                  <c:v>2026</c:v>
+                </c:pt>
+              </c:strCache>
+            </c:strRef>
+          </c:tx>
+          <c:cat>
+            <c:strRef>
+              <c:strCache>
+                <c:ptCount val="3"/>
+                <c:pt idx="0">
+                  <c:v>Q1</c:v>
+                </c:pt>
+                <c:pt idx="1">
+                  <c:v>Q2</c:v>
+                </c:pt>
+                <c:pt idx="2">
+                  <c:v>Q3</c:v>
+                </c:pt>
+              </c:strCache>
+            </c:strRef>
+          </c:cat>
+          <c:val>
+            <c:numRef>
+              <c:numCache>
+                <c:formatCode>General</c:formatCode>
+                <c:ptCount val="3"/>
+                <c:pt idx="0">
+                  <c:v>12</c:v>
+                </c:pt>
+                <c:pt idx="1">
+                  <c:v>17</c:v>
+                </c:pt>
+                <c:pt idx="2">
+                  <c:v>23</c:v>
+                </c:pt>
+              </c:numCache>
+            </c:numRef>
+          </c:val>
+        </c:ser>
+      </c:barChart>
+    </c:plotArea>
+  </c:chart>
+</c:chartSpace>
 </file>
</xml_diff>